<commit_message>
docs: correct contact-form finding in audit report
Co-Authored-By: Claude Opus 5.5 <noreply@anthropic.com>
</commit_message>
<xml_diff>
--- a/audit/ScanEat_SEO_GEO_AEO_Audit_2026-09-26.docx
+++ b/audit/ScanEat_SEO_GEO_AEO_Audit_2026-09-26.docx
@@ -450,7 +450,7 @@
     <w:sdt>
       <w:sdtPr>
         <w:alias w:val="Contents"/>
-        <w:id w:val="147477382"/>
+        <w:id w:val="147466446"/>
       </w:sdtPr>
       <w:sdtContent>
         <w:p>
@@ -480,7 +480,7 @@
             <w:fldChar w:fldCharType="begin"/>
           </w:r>
           <w:r>
-            <w:instrText xml:space="preserve"> HYPERLINK \l _Toc6265 </w:instrText>
+            <w:instrText xml:space="preserve"> HYPERLINK \l _Toc17201 </w:instrText>
           </w:r>
           <w:r>
             <w:fldChar w:fldCharType="separate"/>
@@ -495,7 +495,7 @@
             <w:fldChar w:fldCharType="begin"/>
           </w:r>
           <w:r>
-            <w:instrText xml:space="preserve"> PAGEREF _Toc6265 \h </w:instrText>
+            <w:instrText xml:space="preserve"> PAGEREF _Toc17201 \h </w:instrText>
           </w:r>
           <w:r>
             <w:fldChar w:fldCharType="separate"/>
@@ -518,7 +518,7 @@
             <w:fldChar w:fldCharType="begin"/>
           </w:r>
           <w:r>
-            <w:instrText xml:space="preserve"> HYPERLINK \l _Toc5204 </w:instrText>
+            <w:instrText xml:space="preserve"> HYPERLINK \l _Toc22353 </w:instrText>
           </w:r>
           <w:r>
             <w:fldChar w:fldCharType="separate"/>
@@ -533,7 +533,7 @@
             <w:fldChar w:fldCharType="begin"/>
           </w:r>
           <w:r>
-            <w:instrText xml:space="preserve"> PAGEREF _Toc5204 \h </w:instrText>
+            <w:instrText xml:space="preserve"> PAGEREF _Toc22353 \h </w:instrText>
           </w:r>
           <w:r>
             <w:fldChar w:fldCharType="separate"/>
@@ -556,7 +556,7 @@
             <w:fldChar w:fldCharType="begin"/>
           </w:r>
           <w:r>
-            <w:instrText xml:space="preserve"> HYPERLINK \l _Toc6479 </w:instrText>
+            <w:instrText xml:space="preserve"> HYPERLINK \l _Toc31989 </w:instrText>
           </w:r>
           <w:r>
             <w:fldChar w:fldCharType="separate"/>
@@ -571,7 +571,7 @@
             <w:fldChar w:fldCharType="begin"/>
           </w:r>
           <w:r>
-            <w:instrText xml:space="preserve"> PAGEREF _Toc6479 \h </w:instrText>
+            <w:instrText xml:space="preserve"> PAGEREF _Toc31989 \h </w:instrText>
           </w:r>
           <w:r>
             <w:fldChar w:fldCharType="separate"/>
@@ -594,7 +594,7 @@
             <w:fldChar w:fldCharType="begin"/>
           </w:r>
           <w:r>
-            <w:instrText xml:space="preserve"> HYPERLINK \l _Toc18666 </w:instrText>
+            <w:instrText xml:space="preserve"> HYPERLINK \l _Toc30192 </w:instrText>
           </w:r>
           <w:r>
             <w:fldChar w:fldCharType="separate"/>
@@ -609,7 +609,7 @@
             <w:fldChar w:fldCharType="begin"/>
           </w:r>
           <w:r>
-            <w:instrText xml:space="preserve"> PAGEREF _Toc18666 \h </w:instrText>
+            <w:instrText xml:space="preserve"> PAGEREF _Toc30192 \h </w:instrText>
           </w:r>
           <w:r>
             <w:fldChar w:fldCharType="separate"/>
@@ -632,7 +632,7 @@
             <w:fldChar w:fldCharType="begin"/>
           </w:r>
           <w:r>
-            <w:instrText xml:space="preserve"> HYPERLINK \l _Toc17895 </w:instrText>
+            <w:instrText xml:space="preserve"> HYPERLINK \l _Toc23932 </w:instrText>
           </w:r>
           <w:r>
             <w:fldChar w:fldCharType="separate"/>
@@ -647,7 +647,7 @@
             <w:fldChar w:fldCharType="begin"/>
           </w:r>
           <w:r>
-            <w:instrText xml:space="preserve"> PAGEREF _Toc17895 \h </w:instrText>
+            <w:instrText xml:space="preserve"> PAGEREF _Toc23932 \h </w:instrText>
           </w:r>
           <w:r>
             <w:fldChar w:fldCharType="separate"/>
@@ -670,7 +670,7 @@
             <w:fldChar w:fldCharType="begin"/>
           </w:r>
           <w:r>
-            <w:instrText xml:space="preserve"> HYPERLINK \l _Toc5429 </w:instrText>
+            <w:instrText xml:space="preserve"> HYPERLINK \l _Toc16080 </w:instrText>
           </w:r>
           <w:r>
             <w:fldChar w:fldCharType="separate"/>
@@ -685,7 +685,7 @@
             <w:fldChar w:fldCharType="begin"/>
           </w:r>
           <w:r>
-            <w:instrText xml:space="preserve"> PAGEREF _Toc5429 \h </w:instrText>
+            <w:instrText xml:space="preserve"> PAGEREF _Toc16080 \h </w:instrText>
           </w:r>
           <w:r>
             <w:fldChar w:fldCharType="separate"/>
@@ -708,7 +708,7 @@
             <w:fldChar w:fldCharType="begin"/>
           </w:r>
           <w:r>
-            <w:instrText xml:space="preserve"> HYPERLINK \l _Toc22381 </w:instrText>
+            <w:instrText xml:space="preserve"> HYPERLINK \l _Toc25755 </w:instrText>
           </w:r>
           <w:r>
             <w:fldChar w:fldCharType="separate"/>
@@ -723,7 +723,7 @@
             <w:fldChar w:fldCharType="begin"/>
           </w:r>
           <w:r>
-            <w:instrText xml:space="preserve"> PAGEREF _Toc22381 \h </w:instrText>
+            <w:instrText xml:space="preserve"> PAGEREF _Toc25755 \h </w:instrText>
           </w:r>
           <w:r>
             <w:fldChar w:fldCharType="separate"/>
@@ -746,7 +746,7 @@
             <w:fldChar w:fldCharType="begin"/>
           </w:r>
           <w:r>
-            <w:instrText xml:space="preserve"> HYPERLINK \l _Toc14218 </w:instrText>
+            <w:instrText xml:space="preserve"> HYPERLINK \l _Toc8406 </w:instrText>
           </w:r>
           <w:r>
             <w:fldChar w:fldCharType="separate"/>
@@ -761,7 +761,7 @@
             <w:fldChar w:fldCharType="begin"/>
           </w:r>
           <w:r>
-            <w:instrText xml:space="preserve"> PAGEREF _Toc14218 \h </w:instrText>
+            <w:instrText xml:space="preserve"> PAGEREF _Toc8406 \h </w:instrText>
           </w:r>
           <w:r>
             <w:fldChar w:fldCharType="separate"/>
@@ -788,7 +788,7 @@
         <w:pStyle w:val="2"/>
         <w:pageBreakBefore/>
       </w:pPr>
-      <w:bookmarkStart w:id="0" w:name="_Toc6265"/>
+      <w:bookmarkStart w:id="0" w:name="_Toc17201"/>
       <w:r>
         <w:t>Executive Summary</w:t>
       </w:r>
@@ -1765,7 +1765,7 @@
         <w:pStyle w:val="2"/>
         <w:pageBreakBefore/>
       </w:pPr>
-      <w:bookmarkStart w:id="1" w:name="_Toc5204"/>
+      <w:bookmarkStart w:id="1" w:name="_Toc22353"/>
       <w:r>
         <w:t>Scope &amp; Methodology</w:t>
       </w:r>
@@ -6140,7 +6140,7 @@
         <w:pStyle w:val="2"/>
         <w:pageBreakBefore/>
       </w:pPr>
-      <w:bookmarkStart w:id="2" w:name="_Toc6479"/>
+      <w:bookmarkStart w:id="2" w:name="_Toc31989"/>
       <w:r>
         <w:t>SEO — Search Engine Optimization</w:t>
       </w:r>
@@ -8703,7 +8703,7 @@
         <w:pStyle w:val="2"/>
         <w:pageBreakBefore/>
       </w:pPr>
-      <w:bookmarkStart w:id="3" w:name="_Toc18666"/>
+      <w:bookmarkStart w:id="3" w:name="_Toc30192"/>
       <w:r>
         <w:t>GEO — Generative Engine Optimization</w:t>
       </w:r>
@@ -9425,23 +9425,7 @@
                 <w:sz w:val="18"/>
                 <w:szCs w:val="18"/>
               </w:rPr>
-              <w:t xml:space="preserve">Phone, WhatsApp and hours are shown, but the page displays "This form is UI-only for now. You can connect it with Supabase, Resend, or Formspree." and the Send button is </w:t>
-            </w:r>
-            <w:r>
-              <w:rPr>
-                <w:rFonts w:ascii="Consolas" w:hAnsi="Consolas" w:eastAsia="Consolas" w:cs="Consolas"/>
-                <w:color w:val="1B2A4A"/>
-                <w:sz w:val="16"/>
-                <w:szCs w:val="16"/>
-              </w:rPr>
-              <w:t>type="button"</w:t>
-            </w:r>
-            <w:r>
-              <w:rPr>
-                <w:sz w:val="18"/>
-                <w:szCs w:val="18"/>
-              </w:rPr>
-              <w:t xml:space="preserve"> with no handler — leads are silently lost and the page reads as unfinished.</w:t>
+              <w:t>Phone, WhatsApp and hours are shown, but the page displays "This form is UI-only for now. You can connect it with Supabase, Resend, or Formspree." and the form has no action or submit handler, so Send just reloads the page — leads are silently lost and the page reads as unfinished.</w:t>
             </w:r>
           </w:p>
         </w:tc>
@@ -10394,7 +10378,7 @@
                 <w:sz w:val="20"/>
                 <w:szCs w:val="20"/>
               </w:rPr>
-              <w:t>) and the dead Send button (</w:t>
+              <w:t>) and the handler-less form (</w:t>
             </w:r>
             <w:r>
               <w:rPr>
@@ -10403,7 +10387,7 @@
                 <w:sz w:val="18"/>
                 <w:szCs w:val="18"/>
               </w:rPr>
-              <w:t>components/contact/ContactForm.jsx:108</w:t>
+              <w:t>components/contact/ContactForm.jsx:23</w:t>
             </w:r>
             <w:r>
               <w:rPr>
@@ -10936,7 +10920,7 @@
         <w:pStyle w:val="2"/>
         <w:pageBreakBefore/>
       </w:pPr>
-      <w:bookmarkStart w:id="4" w:name="_Toc17895"/>
+      <w:bookmarkStart w:id="4" w:name="_Toc23932"/>
       <w:r>
         <w:t>AEO — Answer Engine Optimization</w:t>
       </w:r>
@@ -12706,7 +12690,7 @@
         <w:pStyle w:val="2"/>
         <w:pageBreakBefore/>
       </w:pPr>
-      <w:bookmarkStart w:id="5" w:name="_Toc5429"/>
+      <w:bookmarkStart w:id="5" w:name="_Toc16080"/>
       <w:r>
         <w:t>Priority Recommendations</w:t>
       </w:r>
@@ -17006,7 +16990,7 @@
         <w:pStyle w:val="2"/>
         <w:pageBreakBefore/>
       </w:pPr>
-      <w:bookmarkStart w:id="6" w:name="_Toc22381"/>
+      <w:bookmarkStart w:id="6" w:name="_Toc25755"/>
       <w:r>
         <w:t>What's Working Well</w:t>
       </w:r>
@@ -17239,7 +17223,7 @@
         <w:pStyle w:val="2"/>
         <w:pageBreakBefore/>
       </w:pPr>
-      <w:bookmarkStart w:id="7" w:name="_Toc14218"/>
+      <w:bookmarkStart w:id="7" w:name="_Toc8406"/>
       <w:r>
         <w:t>Glossary</w:t>
       </w:r>
@@ -18595,9 +18579,9 @@
 <file path=word/numbering.xml><?xml version="1.0" encoding="utf-8"?>
 <w:numbering xmlns:wpc="http://schemas.microsoft.com/office/word/2010/wordprocessingCanvas" xmlns:mc="http://schemas.openxmlformats.org/markup-compatibility/2006" xmlns:o="urn:schemas-microsoft-com:office:office" xmlns:r="http://schemas.openxmlformats.org/officeDocument/2006/relationships" xmlns:m="http://schemas.openxmlformats.org/officeDocument/2006/math" xmlns:v="urn:schemas-microsoft-com:vml" xmlns:wp14="http://schemas.microsoft.com/office/word/2010/wordprocessingDrawing" xmlns:wp="http://schemas.openxmlformats.org/drawingml/2006/wordprocessingDrawing" xmlns:w10="urn:schemas-microsoft-com:office:word" xmlns:w="http://schemas.openxmlformats.org/wordprocessingml/2006/main" xmlns:w14="http://schemas.microsoft.com/office/word/2010/wordml" xmlns:wpg="http://schemas.microsoft.com/office/word/2010/wordprocessingGroup" xmlns:wpi="http://schemas.microsoft.com/office/word/2010/wordprocessingInk" xmlns:wne="http://schemas.microsoft.com/office/word/2006/wordml" xmlns:wps="http://schemas.microsoft.com/office/word/2010/wordprocessingShape" xmlns:wpsCustomData="http://www.wps.cn/officeDocument/2013/wpsCustomData" mc:Ignorable="w14 wp14">
   <w:abstractNum w:abstractNumId="0">
-    <w:nsid w:val="28A8653E"/>
+    <w:nsid w:val="AEA3F3D4"/>
     <w:multiLevelType w:val="singleLevel"/>
-    <w:tmpl w:val="28A8653E"/>
+    <w:tmpl w:val="AEA3F3D4"/>
     <w:lvl w:ilvl="0" w:tentative="0">
       <w:start w:val="1"/>
       <w:numFmt w:val="decimal"/>
@@ -18609,9 +18593,9 @@
     </w:lvl>
   </w:abstractNum>
   <w:abstractNum w:abstractNumId="1">
-    <w:nsid w:val="6F14F563"/>
+    <w:nsid w:val="41AC09F0"/>
     <w:multiLevelType w:val="singleLevel"/>
-    <w:tmpl w:val="6F14F563"/>
+    <w:tmpl w:val="41AC09F0"/>
     <w:lvl w:ilvl="0" w:tentative="0">
       <w:start w:val="1"/>
       <w:numFmt w:val="bullet"/>
@@ -18733,7 +18717,7 @@
     <w:lsdException w:unhideWhenUsed="0" w:uiPriority="0" w:semiHidden="0" w:name="Body Text Indent 2"/>
     <w:lsdException w:unhideWhenUsed="0" w:uiPriority="0" w:semiHidden="0" w:name="Body Text Indent 3"/>
     <w:lsdException w:unhideWhenUsed="0" w:uiPriority="0" w:semiHidden="0" w:name="Block Text"/>
-    <w:lsdException w:uiPriority="99" w:semiHidden="0" w:name="Hyperlink"/>
+    <w:lsdException w:qFormat="1" w:uiPriority="99" w:semiHidden="0" w:name="Hyperlink"/>
     <w:lsdException w:unhideWhenUsed="0" w:uiPriority="0" w:semiHidden="0" w:name="FollowedHyperlink"/>
     <w:lsdException w:qFormat="1" w:unhideWhenUsed="0" w:uiPriority="0" w:semiHidden="0" w:name="Strong"/>
     <w:lsdException w:qFormat="1" w:unhideWhenUsed="0" w:uiPriority="0" w:semiHidden="0" w:name="Emphasis"/>
@@ -18751,7 +18735,7 @@
     <w:lsdException w:unhideWhenUsed="0" w:uiPriority="0" w:semiHidden="0" w:name="HTML Sample"/>
     <w:lsdException w:unhideWhenUsed="0" w:uiPriority="0" w:semiHidden="0" w:name="HTML Typewriter"/>
     <w:lsdException w:unhideWhenUsed="0" w:uiPriority="0" w:semiHidden="0" w:name="HTML Variable"/>
-    <w:lsdException w:qFormat="1" w:unhideWhenUsed="0" w:uiPriority="0" w:name="Normal Table"/>
+    <w:lsdException w:unhideWhenUsed="0" w:uiPriority="0" w:name="Normal Table"/>
     <w:lsdException w:unhideWhenUsed="0" w:uiPriority="0" w:semiHidden="0" w:name="annotation subject"/>
     <w:lsdException w:unhideWhenUsed="0" w:uiPriority="0" w:semiHidden="0" w:name="Table Simple 1"/>
     <w:lsdException w:unhideWhenUsed="0" w:uiPriority="0" w:semiHidden="0" w:name="Table Simple 2"/>
@@ -19007,7 +18991,6 @@
   <w:style w:type="table" w:default="1" w:styleId="9">
     <w:name w:val="Normal Table"/>
     <w:semiHidden/>
-    <w:qFormat/>
     <w:uiPriority w:val="0"/>
     <w:tblPr>
       <w:tblCellMar>
@@ -19074,6 +19057,7 @@
   <w:style w:type="character" w:styleId="14">
     <w:name w:val="Hyperlink"/>
     <w:unhideWhenUsed/>
+    <w:qFormat/>
     <w:uiPriority w:val="99"/>
     <w:rPr>
       <w:color w:val="0563C1"/>
@@ -19136,7 +19120,6 @@
     <w:link w:val="11"/>
     <w:semiHidden/>
     <w:unhideWhenUsed/>
-    <w:qFormat/>
     <w:uiPriority w:val="99"/>
     <w:rPr>
       <w:sz w:val="20"/>

</xml_diff>